<commit_message>
Lito 40 dias: revisão Parte 5
Co-Authored-By: Claude Opus 5.5 <noreply@anthropic.com>
Claude-Session: https://claude.ai/code/session_01MJjUEEZrxQDEUifKK2vj9g
</commit_message>
<xml_diff>
--- a/roteiros/lito-sousa-morte/LitoSousa40_Parte5.docx
+++ b/roteiros/lito-sousa-morte/LitoSousa40_Parte5.docx
@@ -103,7 +103,7 @@
         <w:rPr>
           <w:color w:val="000000"/>
         </w:rPr>
-        <w:t>Em setembro, deitado em casa, ele disse que ia ser o primeiro a controlar aquela doença no mundo.</w:t>
+        <w:t>Em setembro, já em casa, ele disse que ia ser o primeiro a controlar aquela doença no mundo.</w:t>
       </w:r>
     </w:p>
     <w:p>
@@ -167,7 +167,7 @@
         <w:rPr>
           <w:color w:val="000000"/>
         </w:rPr>
-        <w:t>Ela lembra do medo que tinha. Mila tinha pavor de voar. O homem que passou a vida tirando o medo dos outros tirou o dela também.</w:t>
+        <w:t>Ela lembra do medo que tinha. Mila tinha muito medo de voar. O homem que passou a vida tirando o medo dos outros tirou o dela também.</w:t>
       </w:r>
     </w:p>
     <w:p>
@@ -271,7 +271,7 @@
         <w:rPr>
           <w:color w:val="000000"/>
         </w:rPr>
-        <w:t>O homem que passou a vida inteira ensinando o Brasil a olhar para cima sem medo deixou essa última instrução.</w:t>
+        <w:t>O homem que passou a vida ensinando o Brasil a olhar para cima sem medo recebeu, na voz da esposa, essa última frase.</w:t>
       </w:r>
     </w:p>
     <w:p>
@@ -327,7 +327,7 @@
         <w:rPr>
           <w:color w:val="000000"/>
         </w:rPr>
-        <w:t>Mila trabalhou anos sem folga. Lito fazia planos para janeiro. Um menino de sete anos esperava o pai para jogar bola.</w:t>
+        <w:t>Mila trabalhou anos sem folga. Lito fazia planos para janeiro, e um menino de sete anos esperava o pai para jogar bola.</w:t>
       </w:r>
     </w:p>
     <w:p>
@@ -351,7 +351,7 @@
         <w:rPr>
           <w:color w:val="000000"/>
         </w:rPr>
-        <w:t>Lito sabia disso melhor do que ninguém. Foi justamente por isso que, naquele vídeo de julho, antes de qualquer coisa, ele fez um pedido aos seguidores.</w:t>
+        <w:t>Lito sabia disso. Naquele mesmo vídeo de julho, ele fez um pedido aos seguidores.</w:t>
       </w:r>
     </w:p>
     <w:p>

</xml_diff>